<commit_message>
Docs: fix table right-margin cut-off (fixed table layout)
The gap-analysis and OUTSTANDING roadmap tables were auto-layout, so Word grew
wide columns (long dotted/underscored identifiers and file paths) past the right
page margin, cutting off the rightmost column. Set fixed table layout so Word
honours the column widths and wraps long tokens inside the cell instead.

- gen_gap_v10.cjs: buildTable now uses TableLayoutType.FIXED (all 7 tables).
- generate_outstanding_docx.py: _add_table sets w:tblLayout fixed + explicit
  even cell widths from the section content width (all 8 tables).
Grid widths already summed to the content area; only the layout mode changed.
Manual has no tables. Verified via docx tblLayout/tblGrid audit.

Co-Authored-By: Claude Opus 4.8 <noreply@anthropic.com>
</commit_message>
<xml_diff>
--- a/security_scanner/Phishield_Scanner_Gap_Analysis_v10.docx
+++ b/security_scanner/Phishield_Scanner_Gap_Analysis_v10.docx
@@ -212,6 +212,7 @@
           <w:insideH w:val="single" w:color="auto" w:sz="4"/>
           <w:insideV w:val="single" w:color="auto" w:sz="4"/>
         </w:tblBorders>
+        <w:tblLayout w:type="fixed"/>
       </w:tblPr>
       <w:tblGrid>
         <w:gridCol w:w="1300"/>
@@ -4504,6 +4505,7 @@
           <w:insideH w:val="single" w:color="auto" w:sz="4"/>
           <w:insideV w:val="single" w:color="auto" w:sz="4"/>
         </w:tblBorders>
+        <w:tblLayout w:type="fixed"/>
       </w:tblPr>
       <w:tblGrid>
         <w:gridCol w:w="900"/>
@@ -9401,6 +9403,7 @@
           <w:insideH w:val="single" w:color="auto" w:sz="4"/>
           <w:insideV w:val="single" w:color="auto" w:sz="4"/>
         </w:tblBorders>
+        <w:tblLayout w:type="fixed"/>
       </w:tblPr>
       <w:tblGrid>
         <w:gridCol w:w="2700"/>
@@ -11822,6 +11825,7 @@
           <w:insideH w:val="single" w:color="auto" w:sz="4"/>
           <w:insideV w:val="single" w:color="auto" w:sz="4"/>
         </w:tblBorders>
+        <w:tblLayout w:type="fixed"/>
       </w:tblPr>
       <w:tblGrid>
         <w:gridCol w:w="3500"/>
@@ -13062,6 +13066,7 @@
           <w:insideH w:val="single" w:color="auto" w:sz="4"/>
           <w:insideV w:val="single" w:color="auto" w:sz="4"/>
         </w:tblBorders>
+        <w:tblLayout w:type="fixed"/>
       </w:tblPr>
       <w:tblGrid>
         <w:gridCol w:w="2400"/>
@@ -13850,6 +13855,7 @@
           <w:insideH w:val="single" w:color="auto" w:sz="4"/>
           <w:insideV w:val="single" w:color="auto" w:sz="4"/>
         </w:tblBorders>
+        <w:tblLayout w:type="fixed"/>
       </w:tblPr>
       <w:tblGrid>
         <w:gridCol w:w="1000"/>
@@ -14951,6 +14957,7 @@
           <w:insideH w:val="single" w:color="auto" w:sz="4"/>
           <w:insideV w:val="single" w:color="auto" w:sz="4"/>
         </w:tblBorders>
+        <w:tblLayout w:type="fixed"/>
       </w:tblPr>
       <w:tblGrid>
         <w:gridCol w:w="800"/>

</xml_diff>